<commit_message>
Standardize consolidated-duty count on 26 (was 30): the built A→B crosswalk resolves the drafted 6+24 into 26 consolidated targets. Rename method doc accordingly; regenerate figures and PDF.
Also fixes LICENSE-DOCS attribution title ("...to 30" -> "...to 26"), a straggler the local correction had not covered.

Co-Authored-By: Claude Opus 4.8 (1M context) <noreply@anthropic.com>
Claude-Session: https://claude.ai/code/session_01Lu8qs6GHSzKahYwV9MxmCx
</commit_message>
<xml_diff>
--- a/release/gsib-board-duties_consolidated-proposal_v0.1.docx
+++ b/release/gsib-board-duties_consolidated-proposal_v0.1.docx
@@ -101,10 +101,10 @@
           <w:b/>
           <w:bCs/>
         </w:rPr>
-        <w:t xml:space="preserve">approximately 30</w:t>
-      </w:r>
-      <w:r>
-        <w:t xml:space="preserve">: six general governance mechanics stated once, and twenty-four domain duties. Three moves do the work, and none of them weakens a safeguard:</w:t>
+        <w:t xml:space="preserve">26</w:t>
+      </w:r>
+      <w:r>
+        <w:t xml:space="preserve"> consolidated targets (drafted as six general governance mechanics stated once, plus twenty-four domain duties; four mechanics embed within the domain duties and several duties merge in the A→B crosswalk). Three moves do the work, and none of them weakens a safeguard:</w:t>
       </w:r>
     </w:p>
     <w:p>

</xml_diff>